<commit_message>
fix: use paragraph space_after for gap instead of an empty paragraph
An empty-paragraph gap pushed Andrew's real 5-page CV to 6 pages once
applied throughout the Bibliography. Switching the gap to SPACE_GAP (Pt(8))
of extra space_after on the preceding paragraph gives the same visual
separation without an extra line, keeping the page count.
</commit_message>
<xml_diff>
--- a/sample/Jane_Doe_CV.docx
+++ b/sample/Jane_Doe_CV.docx
@@ -392,6 +392,9 @@
       </w:r>
     </w:p>
     <w:p>
+      <w:pPr>
+        <w:spacing w:after="160"/>
+      </w:pPr>
       <w:r>
         <w:rPr>
           <w:b w:val="0"/>
@@ -400,12 +403,12 @@
         <w:t>*co-first authors</w:t>
       </w:r>
     </w:p>
-    <w:p/>
     <w:p>
       <w:pPr>
         <w:tabs>
           <w:tab w:pos="1440" w:val="left"/>
         </w:tabs>
+        <w:spacing w:after="160"/>
         <w:ind w:left="1440" w:hanging="1440"/>
       </w:pPr>
       <w:r>
@@ -441,12 +444,12 @@
         <w:t>. 226(4):512-520.</w:t>
       </w:r>
     </w:p>
-    <w:p/>
     <w:p>
       <w:pPr>
         <w:tabs>
           <w:tab w:pos="1440" w:val="left"/>
         </w:tabs>
+        <w:spacing w:after="160"/>
         <w:ind w:left="1440" w:hanging="1440"/>
       </w:pPr>
       <w:r>
@@ -489,7 +492,6 @@
         <w:t>. 137(6):1044-1051.</w:t>
       </w:r>
     </w:p>
-    <w:p/>
     <w:p>
       <w:pPr>
         <w:tabs>

</xml_diff>

<commit_message>
feat: 1.15in description column, sub-bullets, and 1in page margins
The evolved CV layout puts every dated entry's description at 1.15" (hanging
indent plus a matching tab stop) and adds `- ` sub-bullets that share that
column with a plain left indent and no glyph. Page side margins drop to 1"
so the printed column lands where the reference layout expects it.

Co-Authored-By: Claude Fable 5 <noreply@anthropic.com>
</commit_message>
<xml_diff>
--- a/sample/Jane_Doe_CV.docx
+++ b/sample/Jane_Doe_CV.docx
@@ -52,9 +52,9 @@
     <w:p>
       <w:pPr>
         <w:tabs>
-          <w:tab w:pos="1440" w:val="left"/>
+          <w:tab w:pos="1656" w:val="left"/>
         </w:tabs>
-        <w:ind w:left="1440" w:hanging="1440"/>
+        <w:ind w:left="1656" w:hanging="1656"/>
       </w:pPr>
       <w:r>
         <w:t>2019-Present</w:t>
@@ -71,9 +71,9 @@
     <w:p>
       <w:pPr>
         <w:tabs>
-          <w:tab w:pos="1440" w:val="left"/>
+          <w:tab w:pos="1656" w:val="left"/>
         </w:tabs>
-        <w:ind w:left="1440" w:hanging="1440"/>
+        <w:ind w:left="1656" w:hanging="1656"/>
       </w:pPr>
       <w:r>
         <w:t>2019-Present</w:t>
@@ -90,9 +90,9 @@
     <w:p>
       <w:pPr>
         <w:tabs>
-          <w:tab w:pos="1440" w:val="left"/>
+          <w:tab w:pos="1656" w:val="left"/>
         </w:tabs>
-        <w:ind w:left="1440" w:hanging="1440"/>
+        <w:ind w:left="1656" w:hanging="1656"/>
       </w:pPr>
       <w:r>
         <w:t>2017-2019</w:t>
@@ -120,9 +120,9 @@
     <w:p>
       <w:pPr>
         <w:tabs>
-          <w:tab w:pos="1440" w:val="left"/>
+          <w:tab w:pos="1656" w:val="left"/>
         </w:tabs>
-        <w:ind w:left="1440" w:hanging="1440"/>
+        <w:ind w:left="1656" w:hanging="1656"/>
       </w:pPr>
       <w:r>
         <w:t>2016-2019</w:t>
@@ -139,9 +139,9 @@
     <w:p>
       <w:pPr>
         <w:tabs>
-          <w:tab w:pos="1440" w:val="left"/>
+          <w:tab w:pos="1656" w:val="left"/>
         </w:tabs>
-        <w:ind w:left="1440" w:hanging="1440"/>
+        <w:ind w:left="1656" w:hanging="1656"/>
       </w:pPr>
       <w:r>
         <w:t>2012-2016</w:t>
@@ -158,9 +158,9 @@
     <w:p>
       <w:pPr>
         <w:tabs>
-          <w:tab w:pos="1440" w:val="left"/>
+          <w:tab w:pos="1656" w:val="left"/>
         </w:tabs>
-        <w:ind w:left="1440" w:hanging="1440"/>
+        <w:ind w:left="1656" w:hanging="1656"/>
       </w:pPr>
       <w:r>
         <w:t>2008-2012</w:t>
@@ -177,9 +177,9 @@
     <w:p>
       <w:pPr>
         <w:tabs>
-          <w:tab w:pos="1440" w:val="left"/>
+          <w:tab w:pos="1656" w:val="left"/>
         </w:tabs>
-        <w:ind w:left="1440" w:hanging="1440"/>
+        <w:ind w:left="1656" w:hanging="1656"/>
       </w:pPr>
       <w:r>
         <w:t>2004-2008</w:t>
@@ -207,9 +207,9 @@
     <w:p>
       <w:pPr>
         <w:tabs>
-          <w:tab w:pos="1440" w:val="left"/>
+          <w:tab w:pos="1656" w:val="left"/>
         </w:tabs>
-        <w:ind w:left="1440" w:hanging="1440"/>
+        <w:ind w:left="1656" w:hanging="1656"/>
       </w:pPr>
       <w:r>
         <w:t>2020</w:t>
@@ -226,9 +226,9 @@
     <w:p>
       <w:pPr>
         <w:tabs>
-          <w:tab w:pos="1440" w:val="left"/>
+          <w:tab w:pos="1656" w:val="left"/>
         </w:tabs>
-        <w:ind w:left="1440" w:hanging="1440"/>
+        <w:ind w:left="1656" w:hanging="1656"/>
       </w:pPr>
       <w:r>
         <w:t>2016</w:t>
@@ -245,9 +245,9 @@
     <w:p>
       <w:pPr>
         <w:tabs>
-          <w:tab w:pos="1440" w:val="left"/>
+          <w:tab w:pos="1656" w:val="left"/>
         </w:tabs>
-        <w:ind w:left="1440" w:hanging="1440"/>
+        <w:ind w:left="1656" w:hanging="1656"/>
       </w:pPr>
       <w:r>
         <w:t>2012</w:t>
@@ -275,9 +275,9 @@
     <w:p>
       <w:pPr>
         <w:tabs>
-          <w:tab w:pos="1440" w:val="left"/>
+          <w:tab w:pos="1656" w:val="left"/>
         </w:tabs>
-        <w:ind w:left="1440" w:hanging="1440"/>
+        <w:ind w:left="1656" w:hanging="1656"/>
       </w:pPr>
       <w:r>
         <w:t>2023</w:t>
@@ -294,9 +294,9 @@
     <w:p>
       <w:pPr>
         <w:tabs>
-          <w:tab w:pos="1440" w:val="left"/>
+          <w:tab w:pos="1656" w:val="left"/>
         </w:tabs>
-        <w:ind w:left="1440" w:hanging="1440"/>
+        <w:ind w:left="1656" w:hanging="1656"/>
       </w:pPr>
       <w:r>
         <w:t>2021</w:t>
@@ -313,9 +313,9 @@
     <w:p>
       <w:pPr>
         <w:tabs>
-          <w:tab w:pos="1440" w:val="left"/>
+          <w:tab w:pos="1656" w:val="left"/>
         </w:tabs>
-        <w:ind w:left="1440" w:hanging="1440"/>
+        <w:ind w:left="1656" w:hanging="1656"/>
       </w:pPr>
       <w:r>
         <w:t>2019</w:t>
@@ -327,6 +327,72 @@
           <w:i w:val="0"/>
         </w:rPr>
         <w:t>Fellow Research Award, General Hospital Department of OB/GYN</w:t>
+      </w:r>
+    </w:p>
+    <w:p>
+      <w:pPr>
+        <w:spacing w:before="240" w:after="80"/>
+      </w:pPr>
+      <w:r>
+        <w:rPr>
+          <w:b/>
+        </w:rPr>
+        <w:t>TEACHING ACTIVITIES</w:t>
+      </w:r>
+    </w:p>
+    <w:p>
+      <w:r>
+        <w:rPr>
+          <w:b w:val="0"/>
+          <w:i w:val="0"/>
+        </w:rPr>
+        <w:t>Obstetrics &amp; Gynecology Residency, General Hospital</w:t>
+      </w:r>
+    </w:p>
+    <w:p>
+      <w:pPr>
+        <w:ind w:left="1656"/>
+      </w:pPr>
+      <w:r>
+        <w:rPr>
+          <w:b w:val="0"/>
+          <w:i w:val="0"/>
+        </w:rPr>
+        <w:t>Designed and implemented the resident curriculum in obstetric ultrasound</w:t>
+      </w:r>
+    </w:p>
+    <w:p>
+      <w:pPr>
+        <w:spacing w:after="160"/>
+        <w:ind w:left="1656"/>
+      </w:pPr>
+      <w:r>
+        <w:rPr>
+          <w:b w:val="0"/>
+          <w:i w:val="0"/>
+        </w:rPr>
+        <w:t>Annual didactics: Hypertensive Disorders of Pregnancy; Fetal Growth Restriction</w:t>
+      </w:r>
+    </w:p>
+    <w:p>
+      <w:r>
+        <w:rPr>
+          <w:b w:val="0"/>
+          <w:i w:val="0"/>
+        </w:rPr>
+        <w:t>Maternal-Fetal Medicine Fellowship, General Hospital</w:t>
+      </w:r>
+    </w:p>
+    <w:p>
+      <w:pPr>
+        <w:ind w:left="1656"/>
+      </w:pPr>
+      <w:r>
+        <w:rPr>
+          <w:b w:val="0"/>
+          <w:i w:val="0"/>
+        </w:rPr>
+        <w:t>Annual didactics: Ultrasound Basics; Doppler Interpretation</w:t>
       </w:r>
     </w:p>
     <w:p>
@@ -354,9 +420,9 @@
     <w:p>
       <w:pPr>
         <w:tabs>
-          <w:tab w:pos="1440" w:val="left"/>
+          <w:tab w:pos="1656" w:val="left"/>
         </w:tabs>
-        <w:ind w:left="1440" w:hanging="1440"/>
+        <w:ind w:left="1656" w:hanging="1656"/>
       </w:pPr>
       <w:r>
         <w:t>2023</w:t>
@@ -406,10 +472,10 @@
     <w:p>
       <w:pPr>
         <w:tabs>
-          <w:tab w:pos="1440" w:val="left"/>
+          <w:tab w:pos="1656" w:val="left"/>
         </w:tabs>
         <w:spacing w:after="160"/>
-        <w:ind w:left="1440" w:hanging="1440"/>
+        <w:ind w:left="1656" w:hanging="1656"/>
       </w:pPr>
       <w:r>
         <w:t>2022</w:t>
@@ -447,10 +513,10 @@
     <w:p>
       <w:pPr>
         <w:tabs>
-          <w:tab w:pos="1440" w:val="left"/>
+          <w:tab w:pos="1656" w:val="left"/>
         </w:tabs>
         <w:spacing w:after="160"/>
-        <w:ind w:left="1440" w:hanging="1440"/>
+        <w:ind w:left="1656" w:hanging="1656"/>
       </w:pPr>
       <w:r>
         <w:t>2021</w:t>
@@ -495,9 +561,9 @@
     <w:p>
       <w:pPr>
         <w:tabs>
-          <w:tab w:pos="1440" w:val="left"/>
+          <w:tab w:pos="1656" w:val="left"/>
         </w:tabs>
-        <w:ind w:left="1440" w:hanging="1440"/>
+        <w:ind w:left="1656" w:hanging="1656"/>
       </w:pPr>
       <w:r>
         <w:t>2020</w:t>
@@ -546,9 +612,9 @@
     <w:p>
       <w:pPr>
         <w:tabs>
-          <w:tab w:pos="1440" w:val="left"/>
+          <w:tab w:pos="1656" w:val="left"/>
         </w:tabs>
-        <w:ind w:left="1440" w:hanging="1440"/>
+        <w:ind w:left="1656" w:hanging="1656"/>
       </w:pPr>
       <w:r>
         <w:t>2022</w:t>
@@ -597,9 +663,9 @@
     <w:p>
       <w:pPr>
         <w:tabs>
-          <w:tab w:pos="1440" w:val="left"/>
+          <w:tab w:pos="1656" w:val="left"/>
         </w:tabs>
-        <w:ind w:left="1440" w:hanging="1440"/>
+        <w:ind w:left="1656" w:hanging="1656"/>
       </w:pPr>
       <w:r>
         <w:t>2019</w:t>
@@ -648,9 +714,9 @@
     <w:p>
       <w:pPr>
         <w:tabs>
-          <w:tab w:pos="1440" w:val="left"/>
+          <w:tab w:pos="1656" w:val="left"/>
         </w:tabs>
-        <w:ind w:left="1440" w:hanging="1440"/>
+        <w:ind w:left="1656" w:hanging="1656"/>
       </w:pPr>
       <w:r>
         <w:t>2023</w:t>
@@ -674,9 +740,9 @@
     <w:p>
       <w:pPr>
         <w:tabs>
-          <w:tab w:pos="1440" w:val="left"/>
+          <w:tab w:pos="1656" w:val="left"/>
         </w:tabs>
-        <w:ind w:left="1440" w:hanging="1440"/>
+        <w:ind w:left="1656" w:hanging="1656"/>
       </w:pPr>
       <w:r>
         <w:t>2021</w:t>
@@ -727,9 +793,9 @@
     <w:p>
       <w:pPr>
         <w:tabs>
-          <w:tab w:pos="1440" w:val="left"/>
+          <w:tab w:pos="1656" w:val="left"/>
         </w:tabs>
-        <w:ind w:left="1440" w:hanging="1440"/>
+        <w:ind w:left="1656" w:hanging="1656"/>
       </w:pPr>
       <w:r>
         <w:t>2024</w:t>
@@ -778,9 +844,9 @@
     <w:p>
       <w:pPr>
         <w:tabs>
-          <w:tab w:pos="1440" w:val="left"/>
+          <w:tab w:pos="1656" w:val="left"/>
         </w:tabs>
-        <w:ind w:left="1440" w:hanging="1440"/>
+        <w:ind w:left="1656" w:hanging="1656"/>
       </w:pPr>
       <w:r>
         <w:t>2023</w:t>
@@ -797,9 +863,9 @@
     <w:p>
       <w:pPr>
         <w:tabs>
-          <w:tab w:pos="1440" w:val="left"/>
+          <w:tab w:pos="1656" w:val="left"/>
         </w:tabs>
-        <w:ind w:left="1440" w:hanging="1440"/>
+        <w:ind w:left="1656" w:hanging="1656"/>
       </w:pPr>
       <w:r>
         <w:t>2022</w:t>
@@ -816,9 +882,9 @@
     <w:p>
       <w:pPr>
         <w:tabs>
-          <w:tab w:pos="1440" w:val="left"/>
+          <w:tab w:pos="1656" w:val="left"/>
         </w:tabs>
-        <w:ind w:left="1440" w:hanging="1440"/>
+        <w:ind w:left="1656" w:hanging="1656"/>
       </w:pPr>
       <w:r>
         <w:t>2021</w:t>
@@ -834,7 +900,7 @@
     </w:p>
     <w:sectPr>
       <w:pgSz w:w="12240" w:h="15840"/>
-      <w:pgMar w:top="1440" w:right="1800" w:bottom="1440" w:left="1800" w:header="720" w:footer="720" w:gutter="0"/>
+      <w:pgMar w:top="1440" w:right="1440" w:bottom="1440" w:left="1440" w:header="720" w:footer="720" w:gutter="0"/>
       <w:cols w:space="720"/>
       <w:docGrid w:linePitch="360"/>
     </w:sectPr>

</xml_diff>

<commit_message>
feat: scaffold sections ([TBC] headers suppress whole section); docs + sample polish
</commit_message>
<xml_diff>
--- a/sample/Jane_Doe_CV.docx
+++ b/sample/Jane_Doe_CV.docx
@@ -327,6 +327,55 @@
           <w:i w:val="0"/>
         </w:rPr>
         <w:t>Fellow Research Award, General Hospital Department of OB/GYN</w:t>
+      </w:r>
+    </w:p>
+    <w:p>
+      <w:pPr>
+        <w:spacing w:before="240" w:after="80"/>
+      </w:pPr>
+      <w:r>
+        <w:rPr>
+          <w:b/>
+        </w:rPr>
+        <w:t>PROFESSIONAL MEMBERSHIPS</w:t>
+      </w:r>
+    </w:p>
+    <w:p>
+      <w:pPr>
+        <w:tabs>
+          <w:tab w:pos="1656" w:val="left"/>
+        </w:tabs>
+        <w:ind w:left="1656" w:hanging="1656"/>
+      </w:pPr>
+      <w:r>
+        <w:t>Current</w:t>
+        <w:tab/>
+      </w:r>
+      <w:r>
+        <w:rPr>
+          <w:b w:val="0"/>
+          <w:i w:val="0"/>
+        </w:rPr>
+        <w:t>Society for Maternal-Fetal Medicine - Member</w:t>
+      </w:r>
+    </w:p>
+    <w:p>
+      <w:pPr>
+        <w:tabs>
+          <w:tab w:pos="1656" w:val="left"/>
+        </w:tabs>
+        <w:ind w:left="1656" w:hanging="1656"/>
+      </w:pPr>
+      <w:r>
+        <w:t>2015-2019</w:t>
+        <w:tab/>
+      </w:r>
+      <w:r>
+        <w:rPr>
+          <w:b w:val="0"/>
+          <w:i w:val="0"/>
+        </w:rPr>
+        <w:t>American College of Obstetricians and Gynecologists - Junior Fellow</w:t>
       </w:r>
     </w:p>
     <w:p>

</xml_diff>

<commit_message>
Adopt the UChicago BSD/COAP CV layout
Restructure the rendered CV to match the template senior faculty circulate
(Romero COAP example): centered CURRICULUM VITAE title block, labeled
contact column, optional right-aligned "Place, M/D/YY" dated line, bold
all-caps section headings, italic-underlined subsections, 1" date column,
and a Name / Month Year / Page X of Y footer. Font stays Calibri.

New grammar: `Label: value` contact lines, `Dated: Place`, `1. ` numbered
items, `Title | dates` heading lines with right-aligned dates (grants),
indented `  - ` glyph bullets, `---` page break, `***bold italic***` and
`<u>underline</u>`. `--date` pins the CV date. `private/` is gitignored for
real people's CVs.

Co-Authored-By: Claude Opus 5.5 <noreply@anthropic.com>
</commit_message>
<xml_diff>
--- a/sample/Jane_Doe_CV.docx
+++ b/sample/Jane_Doe_CV.docx
@@ -3,24 +3,73 @@
 <w:document xmlns:wpc="http://schemas.microsoft.com/office/word/2010/wordprocessingCanvas" xmlns:mo="http://schemas.microsoft.com/office/mac/office/2008/main" xmlns:mc="http://schemas.openxmlformats.org/markup-compatibility/2006" xmlns:mv="urn:schemas-microsoft-com:mac:vml" xmlns:o="urn:schemas-microsoft-com:office:office" xmlns:r="http://schemas.openxmlformats.org/officeDocument/2006/relationships" xmlns:m="http://schemas.openxmlformats.org/officeDocument/2006/math" xmlns:v="urn:schemas-microsoft-com:vml" xmlns:wp14="http://schemas.microsoft.com/office/word/2010/wordprocessingDrawing" xmlns:wp="http://schemas.openxmlformats.org/drawingml/2006/wordprocessingDrawing" xmlns:w10="urn:schemas-microsoft-com:office:word" xmlns:w="http://schemas.openxmlformats.org/wordprocessingml/2006/main" xmlns:w14="http://schemas.microsoft.com/office/word/2010/wordml" xmlns:wpg="http://schemas.microsoft.com/office/word/2010/wordprocessingGroup" xmlns:wpi="http://schemas.microsoft.com/office/word/2010/wordprocessingInk" xmlns:wne="http://schemas.microsoft.com/office/word/2006/wordml" xmlns:wps="http://schemas.microsoft.com/office/word/2010/wordprocessingShape" mc:Ignorable="w14 wp14">
   <w:body>
     <w:p>
+      <w:pPr>
+        <w:jc w:val="center"/>
+      </w:pPr>
       <w:r>
         <w:rPr>
           <w:b/>
-          <w:sz w:val="32"/>
+          <w:sz w:val="22"/>
+        </w:rPr>
+        <w:t>CURRICULUM VITAE</w:t>
+      </w:r>
+    </w:p>
+    <w:p>
+      <w:pPr>
+        <w:jc w:val="center"/>
+      </w:pPr>
+      <w:r>
+        <w:rPr>
+          <w:b/>
+          <w:sz w:val="22"/>
         </w:rPr>
         <w:t>Jane Doe, MD</w:t>
       </w:r>
     </w:p>
     <w:p>
+      <w:pPr>
+        <w:jc w:val="right"/>
+      </w:pPr>
+      <w:r>
+        <w:t>Springfield, 10/8/26</w:t>
+      </w:r>
+    </w:p>
+    <w:p/>
+    <w:p>
+      <w:pPr>
+        <w:tabs>
+          <w:tab w:pos="1440" w:val="left"/>
+        </w:tabs>
+        <w:ind w:left="1440" w:hanging="1440"/>
+      </w:pPr>
+      <w:r>
+        <w:t>Address:</w:t>
+        <w:tab/>
+      </w:r>
       <w:r>
         <w:rPr>
           <w:b w:val="0"/>
           <w:i w:val="0"/>
         </w:rPr>
-        <w:t>General Hospital, Department of Obstetrics &amp; Gynecology</w:t>
+        <w:t>General Hospital</w:t>
       </w:r>
     </w:p>
     <w:p>
+      <w:pPr>
+        <w:ind w:left="1440"/>
+      </w:pPr>
+      <w:r>
+        <w:rPr>
+          <w:b w:val="0"/>
+          <w:i w:val="0"/>
+        </w:rPr>
+        <w:t>Department of Obstetrics &amp; Gynecology</w:t>
+      </w:r>
+    </w:p>
+    <w:p>
+      <w:pPr>
+        <w:ind w:left="1440"/>
+      </w:pPr>
       <w:r>
         <w:rPr>
           <w:b w:val="0"/>
@@ -30,17 +79,47 @@
       </w:r>
     </w:p>
     <w:p>
+      <w:pPr>
+        <w:tabs>
+          <w:tab w:pos="1440" w:val="left"/>
+        </w:tabs>
+        <w:ind w:left="1440" w:hanging="1440"/>
+      </w:pPr>
+      <w:r>
+        <w:t>Telephone:</w:t>
+        <w:tab/>
+      </w:r>
       <w:r>
         <w:rPr>
           <w:b w:val="0"/>
           <w:i w:val="0"/>
         </w:rPr>
-        <w:t>jane.doe@generalhospital.org | (555) 123-4567</w:t>
+        <w:t>(555) 123-4567</w:t>
       </w:r>
     </w:p>
     <w:p>
       <w:pPr>
-        <w:spacing w:before="240" w:after="80"/>
+        <w:tabs>
+          <w:tab w:pos="1440" w:val="left"/>
+        </w:tabs>
+        <w:ind w:left="1440" w:hanging="1440"/>
+      </w:pPr>
+      <w:r>
+        <w:t>Email:</w:t>
+        <w:tab/>
+      </w:r>
+      <w:r>
+        <w:rPr>
+          <w:b w:val="0"/>
+          <w:i w:val="0"/>
+        </w:rPr>
+        <w:t>jane.doe@generalhospital.org</w:t>
+      </w:r>
+    </w:p>
+    <w:p>
+      <w:pPr>
+        <w:keepNext/>
+        <w:spacing w:before="240" w:after="0"/>
       </w:pPr>
       <w:r>
         <w:rPr>
@@ -52,9 +131,9 @@
     <w:p>
       <w:pPr>
         <w:tabs>
-          <w:tab w:pos="1656" w:val="left"/>
+          <w:tab w:pos="1440" w:val="left"/>
         </w:tabs>
-        <w:ind w:left="1656" w:hanging="1656"/>
+        <w:ind w:left="1440" w:hanging="1440"/>
       </w:pPr>
       <w:r>
         <w:t>2019-Present</w:t>
@@ -71,9 +150,9 @@
     <w:p>
       <w:pPr>
         <w:tabs>
-          <w:tab w:pos="1656" w:val="left"/>
+          <w:tab w:pos="1440" w:val="left"/>
         </w:tabs>
-        <w:ind w:left="1656" w:hanging="1656"/>
+        <w:ind w:left="1440" w:hanging="1440"/>
       </w:pPr>
       <w:r>
         <w:t>2019-Present</w:t>
@@ -90,9 +169,9 @@
     <w:p>
       <w:pPr>
         <w:tabs>
-          <w:tab w:pos="1656" w:val="left"/>
+          <w:tab w:pos="1440" w:val="left"/>
         </w:tabs>
-        <w:ind w:left="1656" w:hanging="1656"/>
+        <w:ind w:left="1440" w:hanging="1440"/>
       </w:pPr>
       <w:r>
         <w:t>2017-2019</w:t>
@@ -108,7 +187,8 @@
     </w:p>
     <w:p>
       <w:pPr>
-        <w:spacing w:before="240" w:after="80"/>
+        <w:keepNext/>
+        <w:spacing w:before="240" w:after="0"/>
       </w:pPr>
       <w:r>
         <w:rPr>
@@ -120,9 +200,9 @@
     <w:p>
       <w:pPr>
         <w:tabs>
-          <w:tab w:pos="1656" w:val="left"/>
+          <w:tab w:pos="1440" w:val="left"/>
         </w:tabs>
-        <w:ind w:left="1656" w:hanging="1656"/>
+        <w:ind w:left="1440" w:hanging="1440"/>
       </w:pPr>
       <w:r>
         <w:t>2016-2019</w:t>
@@ -139,9 +219,9 @@
     <w:p>
       <w:pPr>
         <w:tabs>
-          <w:tab w:pos="1656" w:val="left"/>
+          <w:tab w:pos="1440" w:val="left"/>
         </w:tabs>
-        <w:ind w:left="1656" w:hanging="1656"/>
+        <w:ind w:left="1440" w:hanging="1440"/>
       </w:pPr>
       <w:r>
         <w:t>2012-2016</w:t>
@@ -158,9 +238,9 @@
     <w:p>
       <w:pPr>
         <w:tabs>
-          <w:tab w:pos="1656" w:val="left"/>
+          <w:tab w:pos="1440" w:val="left"/>
         </w:tabs>
-        <w:ind w:left="1656" w:hanging="1656"/>
+        <w:ind w:left="1440" w:hanging="1440"/>
       </w:pPr>
       <w:r>
         <w:t>2008-2012</w:t>
@@ -177,9 +257,9 @@
     <w:p>
       <w:pPr>
         <w:tabs>
-          <w:tab w:pos="1656" w:val="left"/>
+          <w:tab w:pos="1440" w:val="left"/>
         </w:tabs>
-        <w:ind w:left="1656" w:hanging="1656"/>
+        <w:ind w:left="1440" w:hanging="1440"/>
       </w:pPr>
       <w:r>
         <w:t>2004-2008</w:t>
@@ -195,7 +275,8 @@
     </w:p>
     <w:p>
       <w:pPr>
-        <w:spacing w:before="240" w:after="80"/>
+        <w:keepNext/>
+        <w:spacing w:before="240" w:after="0"/>
       </w:pPr>
       <w:r>
         <w:rPr>
@@ -207,9 +288,9 @@
     <w:p>
       <w:pPr>
         <w:tabs>
-          <w:tab w:pos="1656" w:val="left"/>
+          <w:tab w:pos="1440" w:val="left"/>
         </w:tabs>
-        <w:ind w:left="1656" w:hanging="1656"/>
+        <w:ind w:left="1440" w:hanging="1440"/>
       </w:pPr>
       <w:r>
         <w:t>2020</w:t>
@@ -226,9 +307,9 @@
     <w:p>
       <w:pPr>
         <w:tabs>
-          <w:tab w:pos="1656" w:val="left"/>
+          <w:tab w:pos="1440" w:val="left"/>
         </w:tabs>
-        <w:ind w:left="1656" w:hanging="1656"/>
+        <w:ind w:left="1440" w:hanging="1440"/>
       </w:pPr>
       <w:r>
         <w:t>2016</w:t>
@@ -245,9 +326,9 @@
     <w:p>
       <w:pPr>
         <w:tabs>
-          <w:tab w:pos="1656" w:val="left"/>
+          <w:tab w:pos="1440" w:val="left"/>
         </w:tabs>
-        <w:ind w:left="1656" w:hanging="1656"/>
+        <w:ind w:left="1440" w:hanging="1440"/>
       </w:pPr>
       <w:r>
         <w:t>2012</w:t>
@@ -263,7 +344,8 @@
     </w:p>
     <w:p>
       <w:pPr>
-        <w:spacing w:before="240" w:after="80"/>
+        <w:keepNext/>
+        <w:spacing w:before="240" w:after="0"/>
       </w:pPr>
       <w:r>
         <w:rPr>
@@ -275,9 +357,9 @@
     <w:p>
       <w:pPr>
         <w:tabs>
-          <w:tab w:pos="1656" w:val="left"/>
+          <w:tab w:pos="1440" w:val="left"/>
         </w:tabs>
-        <w:ind w:left="1656" w:hanging="1656"/>
+        <w:ind w:left="1440" w:hanging="1440"/>
       </w:pPr>
       <w:r>
         <w:t>2023</w:t>
@@ -294,9 +376,9 @@
     <w:p>
       <w:pPr>
         <w:tabs>
-          <w:tab w:pos="1656" w:val="left"/>
+          <w:tab w:pos="1440" w:val="left"/>
         </w:tabs>
-        <w:ind w:left="1656" w:hanging="1656"/>
+        <w:ind w:left="1440" w:hanging="1440"/>
       </w:pPr>
       <w:r>
         <w:t>2021</w:t>
@@ -313,9 +395,9 @@
     <w:p>
       <w:pPr>
         <w:tabs>
-          <w:tab w:pos="1656" w:val="left"/>
+          <w:tab w:pos="1440" w:val="left"/>
         </w:tabs>
-        <w:ind w:left="1656" w:hanging="1656"/>
+        <w:ind w:left="1440" w:hanging="1440"/>
       </w:pPr>
       <w:r>
         <w:t>2019</w:t>
@@ -331,7 +413,8 @@
     </w:p>
     <w:p>
       <w:pPr>
-        <w:spacing w:before="240" w:after="80"/>
+        <w:keepNext/>
+        <w:spacing w:before="240" w:after="0"/>
       </w:pPr>
       <w:r>
         <w:rPr>
@@ -343,9 +426,9 @@
     <w:p>
       <w:pPr>
         <w:tabs>
-          <w:tab w:pos="1656" w:val="left"/>
+          <w:tab w:pos="1440" w:val="left"/>
         </w:tabs>
-        <w:ind w:left="1656" w:hanging="1656"/>
+        <w:ind w:left="1440" w:hanging="1440"/>
       </w:pPr>
       <w:r>
         <w:t>Current</w:t>
@@ -362,9 +445,9 @@
     <w:p>
       <w:pPr>
         <w:tabs>
-          <w:tab w:pos="1656" w:val="left"/>
+          <w:tab w:pos="1440" w:val="left"/>
         </w:tabs>
-        <w:ind w:left="1656" w:hanging="1656"/>
+        <w:ind w:left="1440" w:hanging="1440"/>
       </w:pPr>
       <w:r>
         <w:t>2015-2019</w:t>
@@ -380,7 +463,159 @@
     </w:p>
     <w:p>
       <w:pPr>
-        <w:spacing w:before="240" w:after="80"/>
+        <w:keepNext/>
+        <w:spacing w:before="240" w:after="0"/>
+      </w:pPr>
+      <w:r>
+        <w:rPr>
+          <w:b/>
+        </w:rPr>
+        <w:t>CLINICAL ACTIVITIES</w:t>
+      </w:r>
+    </w:p>
+    <w:p>
+      <w:pPr>
+        <w:tabs>
+          <w:tab w:pos="1440" w:val="left"/>
+        </w:tabs>
+        <w:ind w:left="1440" w:hanging="1440"/>
+      </w:pPr>
+      <w:r>
+        <w:t>2019-Present</w:t>
+        <w:tab/>
+      </w:r>
+      <w:r>
+        <w:rPr>
+          <w:b w:val="0"/>
+          <w:i w:val="0"/>
+        </w:rPr>
+        <w:t>Maternal-Fetal Medicine Attending, General Hospital. Clinical focus:</w:t>
+      </w:r>
+    </w:p>
+    <w:p>
+      <w:pPr>
+        <w:tabs>
+          <w:tab w:pos="1800" w:val="left"/>
+        </w:tabs>
+        <w:ind w:left="1800" w:hanging="360"/>
+      </w:pPr>
+      <w:r>
+        <w:t>•</w:t>
+        <w:tab/>
+      </w:r>
+      <w:r>
+        <w:rPr>
+          <w:b w:val="0"/>
+          <w:i w:val="0"/>
+        </w:rPr>
+        <w:t>Hypertensive disorders of pregnancy</w:t>
+      </w:r>
+    </w:p>
+    <w:p>
+      <w:pPr>
+        <w:tabs>
+          <w:tab w:pos="1800" w:val="left"/>
+        </w:tabs>
+        <w:ind w:left="1800" w:hanging="360"/>
+      </w:pPr>
+      <w:r>
+        <w:t>•</w:t>
+        <w:tab/>
+      </w:r>
+      <w:r>
+        <w:rPr>
+          <w:b w:val="0"/>
+          <w:i w:val="0"/>
+        </w:rPr>
+        <w:t>Fetal growth restriction and antenatal surveillance</w:t>
+      </w:r>
+    </w:p>
+    <w:p>
+      <w:pPr>
+        <w:keepNext/>
+        <w:spacing w:before="240" w:after="0"/>
+      </w:pPr>
+      <w:r>
+        <w:rPr>
+          <w:b/>
+        </w:rPr>
+        <w:t>FUNDING</w:t>
+      </w:r>
+    </w:p>
+    <w:p>
+      <w:pPr>
+        <w:keepNext/>
+        <w:spacing w:before="160"/>
+      </w:pPr>
+      <w:r>
+        <w:rPr>
+          <w:b w:val="0"/>
+          <w:i/>
+          <w:u w:val="single"/>
+        </w:rPr>
+        <w:t>(a) Current</w:t>
+      </w:r>
+    </w:p>
+    <w:p>
+      <w:pPr>
+        <w:keepNext/>
+        <w:tabs>
+          <w:tab w:pos="9450" w:val="right"/>
+        </w:tabs>
+        <w:ind w:left="360"/>
+      </w:pPr>
+      <w:r>
+        <w:rPr>
+          <w:b/>
+          <w:i w:val="0"/>
+        </w:rPr>
+        <w:t>Hospital Foundation Junior Investigator Award</w:t>
+      </w:r>
+      <w:r>
+        <w:tab/>
+        <w:t>2022-2024</w:t>
+      </w:r>
+    </w:p>
+    <w:p>
+      <w:pPr>
+        <w:ind w:left="360"/>
+      </w:pPr>
+      <w:r>
+        <w:rPr>
+          <w:b w:val="0"/>
+          <w:i w:val="0"/>
+        </w:rPr>
+        <w:t>"Aspirin timing and preeclampsia prevention"</w:t>
+      </w:r>
+    </w:p>
+    <w:p>
+      <w:pPr>
+        <w:ind w:left="360"/>
+      </w:pPr>
+      <w:r>
+        <w:rPr>
+          <w:b w:val="0"/>
+          <w:i w:val="0"/>
+        </w:rPr>
+        <w:t>Role on Project: Principal Investigator</w:t>
+      </w:r>
+    </w:p>
+    <w:p>
+      <w:pPr>
+        <w:ind w:left="360"/>
+      </w:pPr>
+      <w:r>
+        <w:rPr>
+          <w:b w:val="0"/>
+          <w:i w:val="0"/>
+        </w:rPr>
+        <w:t>Total Costs: $50,000</w:t>
+      </w:r>
+    </w:p>
+    <w:p>
+      <w:pPr>
+        <w:keepNext/>
+        <w:spacing w:before="240" w:after="0"/>
       </w:pPr>
       <w:r>
         <w:rPr>
@@ -400,7 +635,7 @@
     </w:p>
     <w:p>
       <w:pPr>
-        <w:ind w:left="1656"/>
+        <w:ind w:left="1440"/>
       </w:pPr>
       <w:r>
         <w:rPr>
@@ -412,8 +647,8 @@
     </w:p>
     <w:p>
       <w:pPr>
-        <w:spacing w:after="160"/>
-        <w:ind w:left="1656"/>
+        <w:spacing w:after="220"/>
+        <w:ind w:left="1440"/>
       </w:pPr>
       <w:r>
         <w:rPr>
@@ -434,7 +669,7 @@
     </w:p>
     <w:p>
       <w:pPr>
-        <w:ind w:left="1656"/>
+        <w:ind w:left="1440"/>
       </w:pPr>
       <w:r>
         <w:rPr>
@@ -446,7 +681,8 @@
     </w:p>
     <w:p>
       <w:pPr>
-        <w:spacing w:before="240" w:after="80"/>
+        <w:keepNext/>
+        <w:spacing w:before="240" w:after="0"/>
       </w:pPr>
       <w:r>
         <w:rPr>
@@ -457,11 +693,14 @@
     </w:p>
     <w:p>
       <w:pPr>
-        <w:spacing w:before="120"/>
+        <w:keepNext/>
+        <w:spacing w:before="160"/>
       </w:pPr>
       <w:r>
         <w:rPr>
-          <w:b/>
+          <w:b w:val="0"/>
+          <w:i/>
+          <w:u w:val="single"/>
         </w:rPr>
         <w:t>(a) Peer-reviewed Publications</w:t>
       </w:r>
@@ -469,18 +708,19 @@
     <w:p>
       <w:pPr>
         <w:tabs>
-          <w:tab w:pos="1656" w:val="left"/>
+          <w:tab w:pos="450" w:val="left"/>
         </w:tabs>
-        <w:ind w:left="1656" w:hanging="1656"/>
+        <w:ind w:left="450" w:hanging="360"/>
       </w:pPr>
       <w:r>
-        <w:t>2023</w:t>
+        <w:t>1.</w:t>
         <w:tab/>
       </w:r>
       <w:r>
         <w:rPr>
-          <w:b/>
+          <w:b w:val="0"/>
           <w:i w:val="0"/>
+          <w:u w:val="single"/>
         </w:rPr>
         <w:t>Doe J</w:t>
       </w:r>
@@ -493,7 +733,7 @@
       </w:r>
       <w:r>
         <w:rPr>
-          <w:b w:val="0"/>
+          <w:b/>
           <w:i/>
         </w:rPr>
         <w:t>Journal of Maternal-Fetal Medicine</w:t>
@@ -503,12 +743,12 @@
           <w:b w:val="0"/>
           <w:i w:val="0"/>
         </w:rPr>
-        <w:t>. 41(3):210-218.</w:t>
+        <w:t>. 2023;41(3):210-218.</w:t>
       </w:r>
     </w:p>
     <w:p>
       <w:pPr>
-        <w:spacing w:after="160"/>
+        <w:spacing w:after="220"/>
       </w:pPr>
       <w:r>
         <w:rPr>
@@ -521,19 +761,20 @@
     <w:p>
       <w:pPr>
         <w:tabs>
-          <w:tab w:pos="1656" w:val="left"/>
+          <w:tab w:pos="450" w:val="left"/>
         </w:tabs>
-        <w:spacing w:after="160"/>
-        <w:ind w:left="1656" w:hanging="1656"/>
+        <w:spacing w:after="220"/>
+        <w:ind w:left="450" w:hanging="360"/>
       </w:pPr>
       <w:r>
-        <w:t>2022</w:t>
+        <w:t>2.</w:t>
         <w:tab/>
       </w:r>
       <w:r>
         <w:rPr>
-          <w:b/>
+          <w:b w:val="0"/>
           <w:i w:val="0"/>
+          <w:u w:val="single"/>
         </w:rPr>
         <w:t>Doe J</w:t>
       </w:r>
@@ -546,7 +787,7 @@
       </w:r>
       <w:r>
         <w:rPr>
-          <w:b w:val="0"/>
+          <w:b/>
           <w:i/>
         </w:rPr>
         <w:t>American Journal of Obstetrics and Gynecology</w:t>
@@ -556,19 +797,19 @@
           <w:b w:val="0"/>
           <w:i w:val="0"/>
         </w:rPr>
-        <w:t>. 226(4):512-520.</w:t>
+        <w:t>. 2022;226(4):512-520.</w:t>
       </w:r>
     </w:p>
     <w:p>
       <w:pPr>
         <w:tabs>
-          <w:tab w:pos="1656" w:val="left"/>
+          <w:tab w:pos="450" w:val="left"/>
         </w:tabs>
-        <w:spacing w:after="160"/>
-        <w:ind w:left="1656" w:hanging="1656"/>
+        <w:spacing w:after="220"/>
+        <w:ind w:left="450" w:hanging="360"/>
       </w:pPr>
       <w:r>
-        <w:t>2021</w:t>
+        <w:t>3.</w:t>
         <w:tab/>
       </w:r>
       <w:r>
@@ -580,8 +821,9 @@
       </w:r>
       <w:r>
         <w:rPr>
-          <w:b/>
+          <w:b w:val="0"/>
           <w:i w:val="0"/>
+          <w:u w:val="single"/>
         </w:rPr>
         <w:t>Doe J</w:t>
       </w:r>
@@ -594,7 +836,7 @@
       </w:r>
       <w:r>
         <w:rPr>
-          <w:b w:val="0"/>
+          <w:b/>
           <w:i/>
         </w:rPr>
         <w:t>Obstetrics &amp; Gynecology</w:t>
@@ -604,24 +846,25 @@
           <w:b w:val="0"/>
           <w:i w:val="0"/>
         </w:rPr>
-        <w:t>. 137(6):1044-1051.</w:t>
+        <w:t>. 2021;137(6):1044-1051.</w:t>
       </w:r>
     </w:p>
     <w:p>
       <w:pPr>
         <w:tabs>
-          <w:tab w:pos="1656" w:val="left"/>
+          <w:tab w:pos="450" w:val="left"/>
         </w:tabs>
-        <w:ind w:left="1656" w:hanging="1656"/>
+        <w:ind w:left="450" w:hanging="360"/>
       </w:pPr>
       <w:r>
-        <w:t>2020</w:t>
+        <w:t>4.</w:t>
         <w:tab/>
       </w:r>
       <w:r>
         <w:rPr>
-          <w:b/>
+          <w:b w:val="0"/>
           <w:i w:val="0"/>
+          <w:u w:val="single"/>
         </w:rPr>
         <w:t>Doe J</w:t>
       </w:r>
@@ -634,7 +877,7 @@
       </w:r>
       <w:r>
         <w:rPr>
-          <w:b w:val="0"/>
+          <w:b/>
           <w:i/>
         </w:rPr>
         <w:t>Ultrasound in Obstetrics &amp; Gynecology</w:t>
@@ -644,16 +887,19 @@
           <w:b w:val="0"/>
           <w:i w:val="0"/>
         </w:rPr>
-        <w:t>. 55(2):201-209.</w:t>
+        <w:t>. 2020;55(2):201-209.</w:t>
       </w:r>
     </w:p>
     <w:p>
       <w:pPr>
-        <w:spacing w:before="120"/>
+        <w:keepNext/>
+        <w:spacing w:before="160"/>
       </w:pPr>
       <w:r>
         <w:rPr>
-          <w:b/>
+          <w:b w:val="0"/>
+          <w:i/>
+          <w:u w:val="single"/>
         </w:rPr>
         <w:t>(b) Book Chapters</w:t>
       </w:r>
@@ -661,18 +907,19 @@
     <w:p>
       <w:pPr>
         <w:tabs>
-          <w:tab w:pos="1656" w:val="left"/>
+          <w:tab w:pos="450" w:val="left"/>
         </w:tabs>
-        <w:ind w:left="1656" w:hanging="1656"/>
+        <w:ind w:left="450" w:hanging="360"/>
       </w:pPr>
       <w:r>
-        <w:t>2022</w:t>
+        <w:t>1.</w:t>
         <w:tab/>
       </w:r>
       <w:r>
         <w:rPr>
-          <w:b/>
+          <w:b w:val="0"/>
           <w:i w:val="0"/>
+          <w:u w:val="single"/>
         </w:rPr>
         <w:t>Doe J</w:t>
       </w:r>
@@ -695,16 +942,19 @@
           <w:b w:val="0"/>
           <w:i w:val="0"/>
         </w:rPr>
-        <w:t>, 4th ed. General Hospital Press.</w:t>
+        <w:t>, 4th ed. General Hospital Press; 2022.</w:t>
       </w:r>
     </w:p>
     <w:p>
       <w:pPr>
-        <w:spacing w:before="120"/>
+        <w:keepNext/>
+        <w:spacing w:before="160"/>
       </w:pPr>
       <w:r>
         <w:rPr>
-          <w:b/>
+          <w:b w:val="0"/>
+          <w:i/>
+          <w:u w:val="single"/>
         </w:rPr>
         <w:t>(c) Case Reports</w:t>
       </w:r>
@@ -712,18 +962,19 @@
     <w:p>
       <w:pPr>
         <w:tabs>
-          <w:tab w:pos="1656" w:val="left"/>
+          <w:tab w:pos="450" w:val="left"/>
         </w:tabs>
-        <w:ind w:left="1656" w:hanging="1656"/>
+        <w:ind w:left="450" w:hanging="360"/>
       </w:pPr>
       <w:r>
-        <w:t>2019</w:t>
+        <w:t>1.</w:t>
         <w:tab/>
       </w:r>
       <w:r>
         <w:rPr>
-          <w:b/>
+          <w:b w:val="0"/>
           <w:i w:val="0"/>
+          <w:u w:val="single"/>
         </w:rPr>
         <w:t>Doe J</w:t>
       </w:r>
@@ -736,7 +987,7 @@
       </w:r>
       <w:r>
         <w:rPr>
-          <w:b w:val="0"/>
+          <w:b/>
           <w:i/>
         </w:rPr>
         <w:t>Journal of Maternal-Fetal Medicine Case Reports</w:t>
@@ -746,16 +997,19 @@
           <w:b w:val="0"/>
           <w:i w:val="0"/>
         </w:rPr>
-        <w:t>. 3(1):15-19.</w:t>
+        <w:t>. 2019;3(1):15-19.</w:t>
       </w:r>
     </w:p>
     <w:p>
       <w:pPr>
-        <w:spacing w:before="120"/>
+        <w:keepNext/>
+        <w:spacing w:before="160"/>
       </w:pPr>
       <w:r>
         <w:rPr>
-          <w:b/>
+          <w:b w:val="0"/>
+          <w:i/>
+          <w:u w:val="single"/>
         </w:rPr>
         <w:t>(d) Abstracts &amp; Scientific Presentations</w:t>
       </w:r>
@@ -763,18 +1017,20 @@
     <w:p>
       <w:pPr>
         <w:tabs>
-          <w:tab w:pos="1656" w:val="left"/>
+          <w:tab w:pos="450" w:val="left"/>
         </w:tabs>
-        <w:ind w:left="1656" w:hanging="1656"/>
+        <w:spacing w:after="220"/>
+        <w:ind w:left="450" w:hanging="360"/>
       </w:pPr>
       <w:r>
-        <w:t>2023</w:t>
+        <w:t>1.</w:t>
         <w:tab/>
       </w:r>
       <w:r>
         <w:rPr>
-          <w:b/>
+          <w:b w:val="0"/>
           <w:i w:val="0"/>
+          <w:u w:val="single"/>
         </w:rPr>
         <w:t>Doe J</w:t>
       </w:r>
@@ -783,24 +1039,39 @@
           <w:b w:val="0"/>
           <w:i w:val="0"/>
         </w:rPr>
-        <w:t>, Patel S. Early aspirin timing and preeclampsia incidence. Poster, Society for Maternal-Fetal Medicine Annual Meeting.</w:t>
+        <w:t xml:space="preserve">, Patel S. Early aspirin timing and preeclampsia incidence. </w:t>
+      </w:r>
+      <w:r>
+        <w:rPr>
+          <w:b/>
+          <w:i w:val="0"/>
+        </w:rPr>
+        <w:t>Society for Maternal-Fetal Medicine Annual Meeting</w:t>
+      </w:r>
+      <w:r>
+        <w:rPr>
+          <w:b w:val="0"/>
+          <w:i w:val="0"/>
+        </w:rPr>
+        <w:t>, 2023. Poster.</w:t>
       </w:r>
     </w:p>
     <w:p>
       <w:pPr>
         <w:tabs>
-          <w:tab w:pos="1656" w:val="left"/>
+          <w:tab w:pos="450" w:val="left"/>
         </w:tabs>
-        <w:ind w:left="1656" w:hanging="1656"/>
+        <w:ind w:left="450" w:hanging="360"/>
       </w:pPr>
       <w:r>
-        <w:t>2021</w:t>
+        <w:t>2.</w:t>
         <w:tab/>
       </w:r>
       <w:r>
         <w:rPr>
-          <w:b/>
+          <w:b w:val="0"/>
           <w:i w:val="0"/>
+          <w:u w:val="single"/>
         </w:rPr>
         <w:t>Doe J</w:t>
       </w:r>
@@ -809,16 +1080,33 @@
           <w:b w:val="0"/>
           <w:i w:val="0"/>
         </w:rPr>
-        <w:t>, Nguyen T. Cervical length screening in a diverse patient population. Oral presentation, American College of Obstetricians and Gynecologists Annual Clinical Meeting.</w:t>
+        <w:t xml:space="preserve">, Nguyen T. Cervical length screening in a diverse patient population. </w:t>
+      </w:r>
+      <w:r>
+        <w:rPr>
+          <w:b/>
+          <w:i w:val="0"/>
+        </w:rPr>
+        <w:t>American College of Obstetricians and Gynecologists Annual Clinical Meeting</w:t>
+      </w:r>
+      <w:r>
+        <w:rPr>
+          <w:b w:val="0"/>
+          <w:i w:val="0"/>
+        </w:rPr>
+        <w:t>, 2021. Oral presentation.</w:t>
       </w:r>
     </w:p>
     <w:p>
       <w:pPr>
-        <w:spacing w:before="120"/>
+        <w:keepNext/>
+        <w:spacing w:before="160"/>
       </w:pPr>
       <w:r>
         <w:rPr>
-          <w:b/>
+          <w:b w:val="0"/>
+          <w:i/>
+          <w:u w:val="single"/>
         </w:rPr>
         <w:t>(e) Editorials &amp; Letters</w:t>
       </w:r>
@@ -830,11 +1118,14 @@
     </w:p>
     <w:p>
       <w:pPr>
-        <w:spacing w:before="120"/>
+        <w:keepNext/>
+        <w:spacing w:before="160"/>
       </w:pPr>
       <w:r>
         <w:rPr>
-          <w:b/>
+          <w:b w:val="0"/>
+          <w:i/>
+          <w:u w:val="single"/>
         </w:rPr>
         <w:t>(h) Works in review, preparation, etc.</w:t>
       </w:r>
@@ -842,18 +1133,19 @@
     <w:p>
       <w:pPr>
         <w:tabs>
-          <w:tab w:pos="1656" w:val="left"/>
+          <w:tab w:pos="450" w:val="left"/>
         </w:tabs>
-        <w:ind w:left="1656" w:hanging="1656"/>
+        <w:ind w:left="450" w:hanging="360"/>
       </w:pPr>
       <w:r>
-        <w:t>2024</w:t>
+        <w:t>1.</w:t>
         <w:tab/>
       </w:r>
       <w:r>
         <w:rPr>
-          <w:b/>
+          <w:b w:val="0"/>
           <w:i w:val="0"/>
+          <w:u w:val="single"/>
         </w:rPr>
         <w:t>Doe J</w:t>
       </w:r>
@@ -881,7 +1173,8 @@
     </w:p>
     <w:p>
       <w:pPr>
-        <w:spacing w:before="240" w:after="80"/>
+        <w:keepNext/>
+        <w:spacing w:before="240" w:after="0"/>
       </w:pPr>
       <w:r>
         <w:rPr>
@@ -893,9 +1186,9 @@
     <w:p>
       <w:pPr>
         <w:tabs>
-          <w:tab w:pos="1656" w:val="left"/>
+          <w:tab w:pos="1440" w:val="left"/>
         </w:tabs>
-        <w:ind w:left="1656" w:hanging="1656"/>
+        <w:ind w:left="1440" w:hanging="1440"/>
       </w:pPr>
       <w:r>
         <w:t>2023</w:t>
@@ -912,9 +1205,9 @@
     <w:p>
       <w:pPr>
         <w:tabs>
-          <w:tab w:pos="1656" w:val="left"/>
+          <w:tab w:pos="1440" w:val="left"/>
         </w:tabs>
-        <w:ind w:left="1656" w:hanging="1656"/>
+        <w:ind w:left="1440" w:hanging="1440"/>
       </w:pPr>
       <w:r>
         <w:t>2022</w:t>
@@ -931,9 +1224,10 @@
     <w:p>
       <w:pPr>
         <w:tabs>
-          <w:tab w:pos="1656" w:val="left"/>
+          <w:tab w:pos="1440" w:val="left"/>
         </w:tabs>
-        <w:ind w:left="1656" w:hanging="1656"/>
+        <w:spacing w:after="220"/>
+        <w:ind w:left="1440" w:hanging="1440"/>
       </w:pPr>
       <w:r>
         <w:t>2021</w:t>
@@ -947,14 +1241,186 @@
         <w:t>"Fetal Growth Restriction: Surveillance and Timing of Delivery," Regional Maternal-Fetal Medicine Symposium</w:t>
       </w:r>
     </w:p>
+    <w:p>
+      <w:pPr>
+        <w:keepNext/>
+        <w:pageBreakBefore/>
+        <w:spacing w:before="240" w:after="0"/>
+      </w:pPr>
+      <w:r>
+        <w:rPr>
+          <w:b/>
+        </w:rPr>
+        <w:t>CLINICAL STATEMENT</w:t>
+      </w:r>
+    </w:p>
+    <w:p>
+      <w:pPr>
+        <w:keepNext/>
+        <w:spacing w:before="160"/>
+      </w:pPr>
+      <w:r>
+        <w:rPr>
+          <w:b w:val="0"/>
+          <w:i/>
+          <w:u w:val="single"/>
+        </w:rPr>
+        <w:t>(a) Past and current</w:t>
+      </w:r>
+    </w:p>
+    <w:p>
+      <w:r>
+        <w:rPr>
+          <w:b w:val="0"/>
+          <w:i w:val="0"/>
+        </w:rPr>
+        <w:t>My clinical practice centers on high-risk pregnancy care at General Hospital, with an emphasis on hypertensive disorders and fetal growth restriction. I see patients in clinic two days a week and cover labor and delivery four overnight shifts a month.</w:t>
+      </w:r>
+    </w:p>
+    <w:p>
+      <w:pPr>
+        <w:keepNext/>
+        <w:spacing w:before="160"/>
+      </w:pPr>
+      <w:r>
+        <w:rPr>
+          <w:b w:val="0"/>
+          <w:i/>
+          <w:u w:val="single"/>
+        </w:rPr>
+        <w:t>(b) Proposed and future</w:t>
+      </w:r>
+    </w:p>
+    <w:p>
+      <w:r>
+        <w:rPr>
+          <w:b w:val="0"/>
+          <w:i w:val="0"/>
+        </w:rPr>
+        <w:t>I plan to expand the hypertension-in-pregnancy clinic into a regional referral service.</w:t>
+      </w:r>
+    </w:p>
     <w:sectPr>
+      <w:footerReference w:type="default" r:id="rId9"/>
       <w:pgSz w:w="12240" w:h="15840"/>
-      <w:pgMar w:top="1440" w:right="1440" w:bottom="1440" w:left="1440" w:header="720" w:footer="720" w:gutter="0"/>
+      <w:pgMar w:top="1440" w:right="990" w:bottom="1440" w:left="1440" w:header="720" w:footer="720" w:gutter="0"/>
       <w:cols w:space="720"/>
       <w:docGrid w:linePitch="360"/>
     </w:sectPr>
   </w:body>
 </w:document>
+</file>
+
+<file path=word/footer1.xml><?xml version="1.0" encoding="utf-8"?>
+<w:ftr xmlns:m="http://schemas.openxmlformats.org/officeDocument/2006/math" xmlns:mc="http://schemas.openxmlformats.org/markup-compatibility/2006" xmlns:mo="http://schemas.microsoft.com/office/mac/office/2008/main" xmlns:mv="urn:schemas-microsoft-com:mac:vml" xmlns:o="urn:schemas-microsoft-com:office:office" xmlns:r="http://schemas.openxmlformats.org/officeDocument/2006/relationships" xmlns:v="urn:schemas-microsoft-com:vml" xmlns:w10="urn:schemas-microsoft-com:office:word" xmlns:w14="http://schemas.microsoft.com/office/word/2010/wordml" xmlns:w="http://schemas.openxmlformats.org/wordprocessingml/2006/main" xmlns:wne="http://schemas.microsoft.com/office/word/2006/wordml" xmlns:wp14="http://schemas.microsoft.com/office/word/2010/wordprocessingDrawing" xmlns:wp="http://schemas.openxmlformats.org/drawingml/2006/wordprocessingDrawing" xmlns:wpc="http://schemas.microsoft.com/office/word/2010/wordprocessingCanvas" xmlns:wpg="http://schemas.microsoft.com/office/word/2010/wordprocessingGroup" xmlns:wpi="http://schemas.microsoft.com/office/word/2010/wordprocessingInk" xmlns:wps="http://schemas.microsoft.com/office/word/2010/wordprocessingShape" mc:Ignorable="w14 wp14">
+  <w:p>
+    <w:pPr>
+      <w:pStyle w:val="Footer"/>
+      <w:tabs>
+        <w:tab w:pos="4905" w:val="center"/>
+        <w:tab w:pos="9810" w:val="right"/>
+      </w:tabs>
+    </w:pPr>
+    <w:r>
+      <w:rPr>
+        <w:rFonts w:ascii="Calibri" w:hAnsi="Calibri"/>
+        <w:sz w:val="22"/>
+      </w:rPr>
+      <w:t>Jane Doe MD</w:t>
+      <w:tab/>
+      <w:t>October 2026</w:t>
+      <w:tab/>
+      <w:t xml:space="preserve">Page </w:t>
+    </w:r>
+    <w:r>
+      <w:rPr>
+        <w:rFonts w:ascii="Calibri" w:hAnsi="Calibri"/>
+        <w:b/>
+        <w:sz w:val="22"/>
+      </w:rPr>
+      <w:fldChar w:fldCharType="begin"/>
+    </w:r>
+    <w:r>
+      <w:rPr>
+        <w:rFonts w:ascii="Calibri" w:hAnsi="Calibri"/>
+        <w:b/>
+        <w:sz w:val="22"/>
+      </w:rPr>
+      <w:instrText xml:space="preserve"> PAGE </w:instrText>
+    </w:r>
+    <w:r>
+      <w:rPr>
+        <w:rFonts w:ascii="Calibri" w:hAnsi="Calibri"/>
+        <w:b/>
+        <w:sz w:val="22"/>
+      </w:rPr>
+      <w:fldChar w:fldCharType="separate"/>
+    </w:r>
+    <w:r>
+      <w:rPr>
+        <w:rFonts w:ascii="Calibri" w:hAnsi="Calibri"/>
+        <w:b/>
+        <w:sz w:val="22"/>
+      </w:rPr>
+      <w:t>1</w:t>
+    </w:r>
+    <w:r>
+      <w:rPr>
+        <w:rFonts w:ascii="Calibri" w:hAnsi="Calibri"/>
+        <w:b/>
+        <w:sz w:val="22"/>
+      </w:rPr>
+      <w:fldChar w:fldCharType="end"/>
+    </w:r>
+    <w:r>
+      <w:rPr>
+        <w:rFonts w:ascii="Calibri" w:hAnsi="Calibri"/>
+        <w:sz w:val="22"/>
+      </w:rPr>
+      <w:t xml:space="preserve"> of </w:t>
+    </w:r>
+    <w:r>
+      <w:rPr>
+        <w:rFonts w:ascii="Calibri" w:hAnsi="Calibri"/>
+        <w:b/>
+        <w:sz w:val="22"/>
+      </w:rPr>
+      <w:fldChar w:fldCharType="begin"/>
+    </w:r>
+    <w:r>
+      <w:rPr>
+        <w:rFonts w:ascii="Calibri" w:hAnsi="Calibri"/>
+        <w:b/>
+        <w:sz w:val="22"/>
+      </w:rPr>
+      <w:instrText xml:space="preserve"> NUMPAGES </w:instrText>
+    </w:r>
+    <w:r>
+      <w:rPr>
+        <w:rFonts w:ascii="Calibri" w:hAnsi="Calibri"/>
+        <w:b/>
+        <w:sz w:val="22"/>
+      </w:rPr>
+      <w:fldChar w:fldCharType="separate"/>
+    </w:r>
+    <w:r>
+      <w:rPr>
+        <w:rFonts w:ascii="Calibri" w:hAnsi="Calibri"/>
+        <w:b/>
+        <w:sz w:val="22"/>
+      </w:rPr>
+      <w:t>1</w:t>
+    </w:r>
+    <w:r>
+      <w:rPr>
+        <w:rFonts w:ascii="Calibri" w:hAnsi="Calibri"/>
+        <w:b/>
+        <w:sz w:val="22"/>
+      </w:rPr>
+      <w:fldChar w:fldCharType="end"/>
+    </w:r>
+  </w:p>
+</w:ftr>
 </file>
 
 <file path=word/numbering.xml><?xml version="1.0" encoding="utf-8"?>
@@ -1321,7 +1787,7 @@
     <w:qFormat/>
     <w:rsid w:val="00FC693F"/>
     <w:pPr>
-      <w:spacing w:before="0" w:after="40"/>
+      <w:spacing w:before="0" w:after="0" w:line="240" w:lineRule="auto"/>
     </w:pPr>
     <w:rPr>
       <w:rFonts w:ascii="Calibri" w:hAnsi="Calibri"/>

</xml_diff>